<commit_message>
pura mech test page
</commit_message>
<xml_diff>
--- a/documents/Projects List.docx
+++ b/documents/Projects List.docx
@@ -1168,14 +1168,9 @@
       <w:r>
         <w:t xml:space="preserve">. However, the 3D printed indexer did </w:t>
       </w:r>
-      <w:proofErr w:type="gramStart"/>
       <w:r>
         <w:lastRenderedPageBreak/>
-        <w:t>survived</w:t>
-      </w:r>
-      <w:proofErr w:type="gramEnd"/>
-      <w:r>
-        <w:t xml:space="preserve"> all matches without a single time getting jammed or</w:t>
+        <w:t>survived all matches without a single time getting jammed or</w:t>
       </w:r>
       <w:r>
         <w:t xml:space="preserve"> broken, and little wear was found when I inspected it after competition.</w:t>
@@ -2727,6 +2722,7 @@
         <w:t xml:space="preserve">Sample design: </w:t>
       </w:r>
     </w:p>
+    <w:p/>
     <w:p>
       <w:r>
         <w:t xml:space="preserve">Fixture design: </w:t>
@@ -3657,13 +3653,7 @@
         <w:t xml:space="preserve">that </w:t>
       </w:r>
       <w:r>
-        <w:t xml:space="preserve">mounting, soldering, acquisition, and strain-reduction procedure could produce credible measurements. A sealed aluminum beverage can </w:t>
-      </w:r>
-      <w:r>
-        <w:t>provide</w:t>
-      </w:r>
-      <w:r>
-        <w:t xml:space="preserve"> a useful calibration experiment because it behaves </w:t>
+        <w:t xml:space="preserve">mounting, soldering, acquisition, and strain-reduction procedure could produce credible measurements. A sealed aluminum beverage can provide a useful calibration experiment because it behaves </w:t>
       </w:r>
       <w:r>
         <w:t>exactly</w:t>
@@ -3848,13 +3838,7 @@
         <w:t>This test</w:t>
       </w:r>
       <w:r>
-        <w:t xml:space="preserve"> can </w:t>
-      </w:r>
-      <w:r>
-        <w:t>provide</w:t>
-      </w:r>
-      <w:r>
-        <w:t xml:space="preserve"> a much more controlled validation case than immediately testing the complex build-plate assembly</w:t>
+        <w:t xml:space="preserve"> can provide a much more controlled validation case than immediately testing the complex build-plate assembly</w:t>
       </w:r>
       <w:r>
         <w:t xml:space="preserve"> and potentially ruining the parts and wasting strain gauges</w:t>
@@ -3868,19 +3852,10 @@
         <w:t xml:space="preserve">The cold test was then designed to validate the structural FEA of the heated build plate. </w:t>
       </w:r>
       <w:r>
-        <w:t xml:space="preserve">To reproduce the mechanical effect of a </w:t>
-      </w:r>
-      <w:r>
-        <w:t>large printed</w:t>
-      </w:r>
-      <w:r>
-        <w:t xml:space="preserve"> component, I designed a set of machined stainless-steel weights and mounting hardware. The loading system used multiple cylindrical masses that could be attached at controlled positions on the build surface</w:t>
-      </w:r>
-      <w:r>
-        <w:t xml:space="preserve"> </w:t>
-      </w:r>
-      <w:r>
-        <w:t>with the most severe configuration placing the load toward the outer radius of the plate</w:t>
+        <w:t>To reproduce the mechanical effect of a large printed component, I designed a set of machined stainless-steel weights and mounting hardware. The loading system used multiple cylindrical masses that could be attached at controlled positions on the build surface</w:t>
+      </w:r>
+      <w:r>
+        <w:t xml:space="preserve"> with the most severe configuration placing the load toward the outer radius of the plate</w:t>
       </w:r>
       <w:r>
         <w:t>,</w:t>

</xml_diff>